<commit_message>
Fixed link to webpage
link at top was just github.com. changed link to full text for homepage
</commit_message>
<xml_diff>
--- a/resume/StevenOlson.docx
+++ b/resume/StevenOlson.docx
@@ -46,10 +46,28 @@
           <w:b/>
           <w:bCs/>
         </w:rPr>
-        <w:t>GitHub:</w:t>
-      </w:r>
-      <w:r>
-        <w:t xml:space="preserve"> github.com | </w:t>
+        <w:t>Web</w:t>
+      </w:r>
+      <w:r>
+        <w:rPr>
+          <w:b/>
+          <w:bCs/>
+        </w:rPr>
+        <w:t>:</w:t>
+      </w:r>
+      <w:r>
+        <w:t xml:space="preserve"> </w:t>
+      </w:r>
+      <w:hyperlink r:id="rId5" w:history="1">
+        <w:r>
+          <w:rPr>
+            <w:rStyle w:val="Hyperlink"/>
+          </w:rPr>
+          <w:t>https://steveolson357.github.io/bytebank/</w:t>
+        </w:r>
+      </w:hyperlink>
+      <w:r>
+        <w:t xml:space="preserve"> | </w:t>
       </w:r>
       <w:r>
         <w:rPr>
@@ -65,7 +83,7 @@
     <w:p>
       <w:r>
         <w:pict w14:anchorId="314A17A5">
-          <v:rect id="_x0000_i1140" style="width:0;height:1.5pt" o:hralign="center" o:hrstd="t" o:hr="t" fillcolor="#a0a0a0" stroked="f"/>
+          <v:rect id="_x0000_i1025" style="width:0;height:1.5pt" o:hralign="center" o:hrstd="t" o:hr="t" fillcolor="#a0a0a0" stroked="f"/>
         </w:pict>
       </w:r>
     </w:p>
@@ -101,15 +119,7 @@
         <w:t>Systems Integration Specialist</w:t>
       </w:r>
       <w:r>
-        <w:t xml:space="preserve"> </w:t>
-      </w:r>
-      <w:proofErr w:type="gramStart"/>
-      <w:r>
-        <w:t>bridging</w:t>
-      </w:r>
-      <w:proofErr w:type="gramEnd"/>
-      <w:r>
-        <w:t xml:space="preserve"> the gap between digital network infrastructure and physical industrial machinery.</w:t>
+        <w:t xml:space="preserve"> bridging the gap between digital network infrastructure and physical industrial machinery.</w:t>
       </w:r>
     </w:p>
     <w:p>
@@ -178,7 +188,7 @@
     <w:p>
       <w:r>
         <w:pict w14:anchorId="0279E0B3">
-          <v:rect id="_x0000_i1141" style="width:0;height:1.5pt" o:hralign="center" o:hrstd="t" o:hr="t" fillcolor="#a0a0a0" stroked="f"/>
+          <v:rect id="_x0000_i1026" style="width:0;height:1.5pt" o:hralign="center" o:hrstd="t" o:hr="t" fillcolor="#a0a0a0" stroked="f"/>
         </w:pict>
       </w:r>
     </w:p>
@@ -280,7 +290,7 @@
     <w:p>
       <w:r>
         <w:pict w14:anchorId="18ADD8A5">
-          <v:rect id="_x0000_i1142" style="width:0;height:1.5pt" o:hralign="center" o:hrstd="t" o:hr="t" fillcolor="#a0a0a0" stroked="f"/>
+          <v:rect id="_x0000_i1027" style="width:0;height:1.5pt" o:hralign="center" o:hrstd="t" o:hr="t" fillcolor="#a0a0a0" stroked="f"/>
         </w:pict>
       </w:r>
     </w:p>
@@ -326,13 +336,8 @@
         <w:t>Live Simulation Link:</w:t>
       </w:r>
       <w:r>
-        <w:t xml:space="preserve"> techbytrade.itch.io/</w:t>
-      </w:r>
-      <w:proofErr w:type="gramStart"/>
-      <w:r>
-        <w:t>crawl-space</w:t>
-      </w:r>
-      <w:proofErr w:type="gramEnd"/>
+        <w:t xml:space="preserve"> techbytrade.itch.io/crawl-space</w:t>
+      </w:r>
     </w:p>
     <w:p>
       <w:pPr>
@@ -349,35 +354,13 @@
         <w:t>Architecture:</w:t>
       </w:r>
       <w:r>
-        <w:t xml:space="preserve"> Built with </w:t>
-      </w:r>
-      <w:proofErr w:type="spellStart"/>
-      <w:r>
-        <w:t>GameMaker</w:t>
-      </w:r>
-      <w:proofErr w:type="spellEnd"/>
-      <w:r>
-        <w:t xml:space="preserve"> and utilizing custom </w:t>
-      </w:r>
-      <w:proofErr w:type="spellStart"/>
-      <w:r>
-        <w:t>GameMaker</w:t>
-      </w:r>
-      <w:proofErr w:type="spellEnd"/>
-      <w:r>
-        <w:t xml:space="preserve"> Language (GML) scripts that model event loops</w:t>
+        <w:t xml:space="preserve"> Built with GameMaker and utilizing custom GameMaker Language (GML) scripts that model event loops</w:t>
       </w:r>
       <w:r>
         <w:t>, much</w:t>
       </w:r>
       <w:r>
-        <w:t xml:space="preserve"> </w:t>
-      </w:r>
-      <w:r>
-        <w:t>like</w:t>
-      </w:r>
-      <w:r>
-        <w:t xml:space="preserve"> industrial PLCs.</w:t>
+        <w:t xml:space="preserve"> like industrial PLCs.</w:t>
       </w:r>
     </w:p>
     <w:p>
@@ -402,7 +385,7 @@
       <w:r>
         <w:lastRenderedPageBreak/>
         <w:pict w14:anchorId="605CEC76">
-          <v:rect id="_x0000_i1143" style="width:0;height:1.5pt" o:hralign="center" o:hrstd="t" o:hr="t" fillcolor="#a0a0a0" stroked="f"/>
+          <v:rect id="_x0000_i1028" style="width:0;height:1.5pt" o:hralign="center" o:hrstd="t" o:hr="t" fillcolor="#a0a0a0" stroked="f"/>
         </w:pict>
       </w:r>
     </w:p>
@@ -586,7 +569,7 @@
     <w:p>
       <w:r>
         <w:pict w14:anchorId="67E85663">
-          <v:rect id="_x0000_i1144" style="width:0;height:1.5pt" o:hralign="center" o:hrstd="t" o:hr="t" fillcolor="#a0a0a0" stroked="f"/>
+          <v:rect id="_x0000_i1029" style="width:0;height:1.5pt" o:hralign="center" o:hrstd="t" o:hr="t" fillcolor="#a0a0a0" stroked="f"/>
         </w:pict>
       </w:r>
     </w:p>
@@ -5553,6 +5536,7 @@
   <w:style w:type="character" w:default="1" w:styleId="DefaultParagraphFont">
     <w:name w:val="Default Paragraph Font"/>
     <w:uiPriority w:val="1"/>
+    <w:semiHidden/>
     <w:unhideWhenUsed/>
   </w:style>
   <w:style w:type="table" w:default="1" w:styleId="TableNormal">

</xml_diff>